<commit_message>
Estudio Final BdD 09/03
</commit_message>
<xml_diff>
--- a/UTN 2024/Base de datos/Practica MySQL/Esqueletos query.docx
+++ b/UTN 2024/Base de datos/Practica MySQL/Esqueletos query.docx
@@ -7,15 +7,7 @@
         <w:pStyle w:val="Ttulo1"/>
       </w:pPr>
       <w:r>
-        <w:t xml:space="preserve">Esqueleto </w:t>
-      </w:r>
-      <w:proofErr w:type="spellStart"/>
-      <w:r>
-        <w:t>query</w:t>
-      </w:r>
-      <w:proofErr w:type="spellEnd"/>
-      <w:r>
-        <w:t>:</w:t>
+        <w:t>Esqueleto query:</w:t>
       </w:r>
     </w:p>
     <w:p>
@@ -43,126 +35,70 @@
         <w:rPr>
           <w:lang w:val="en-US"/>
         </w:rPr>
-        <w:t xml:space="preserve">FROM </w:t>
-      </w:r>
-      <w:proofErr w:type="spellStart"/>
-      <w:r>
-        <w:rPr>
-          <w:lang w:val="en-US"/>
-        </w:rPr>
-        <w:t>tabla_base</w:t>
-      </w:r>
-      <w:proofErr w:type="spellEnd"/>
-      <w:r>
-        <w:rPr>
-          <w:lang w:val="en-US"/>
-        </w:rPr>
-        <w:t xml:space="preserve"> alias</w:t>
-      </w:r>
-    </w:p>
-    <w:p>
-      <w:pPr>
-        <w:rPr>
-          <w:lang w:val="en-US"/>
-        </w:rPr>
-      </w:pPr>
-      <w:r>
-        <w:rPr>
-          <w:lang w:val="en-US"/>
-        </w:rPr>
-        <w:t xml:space="preserve">  [INNER | LEFT | RIGHT] JOIN tabla2 alias2 ON </w:t>
-      </w:r>
-      <w:proofErr w:type="spellStart"/>
-      <w:r>
-        <w:rPr>
-          <w:lang w:val="en-US"/>
-        </w:rPr>
-        <w:t>condicion_join</w:t>
-      </w:r>
-      <w:proofErr w:type="spellEnd"/>
-    </w:p>
-    <w:p>
-      <w:pPr>
-        <w:rPr>
-          <w:lang w:val="en-US"/>
-        </w:rPr>
-      </w:pPr>
-      <w:r>
-        <w:rPr>
-          <w:lang w:val="en-US"/>
-        </w:rPr>
-        <w:t xml:space="preserve">  [INNER | LEFT | RIGHT] JOIN tabla3 alias3 ON </w:t>
-      </w:r>
-      <w:proofErr w:type="spellStart"/>
-      <w:r>
-        <w:rPr>
-          <w:lang w:val="en-US"/>
-        </w:rPr>
-        <w:t>condicion_join</w:t>
-      </w:r>
-      <w:proofErr w:type="spellEnd"/>
-    </w:p>
-    <w:p>
-      <w:r>
-        <w:t xml:space="preserve">WHERE </w:t>
-      </w:r>
-      <w:proofErr w:type="spellStart"/>
-      <w:r>
-        <w:t>condiciones_fila</w:t>
-      </w:r>
-      <w:proofErr w:type="spellEnd"/>
-    </w:p>
-    <w:p>
-      <w:r>
-        <w:t xml:space="preserve">GROUP BY </w:t>
-      </w:r>
-      <w:proofErr w:type="spellStart"/>
-      <w:r>
-        <w:t>columnas_de_agrupacion</w:t>
-      </w:r>
-      <w:proofErr w:type="spellEnd"/>
-    </w:p>
-    <w:p>
-      <w:pPr>
-        <w:rPr>
-          <w:lang w:val="en-US"/>
-        </w:rPr>
-      </w:pPr>
-      <w:r>
-        <w:rPr>
-          <w:lang w:val="en-US"/>
-        </w:rPr>
-        <w:t xml:space="preserve">HAVING </w:t>
-      </w:r>
-      <w:proofErr w:type="spellStart"/>
-      <w:r>
-        <w:rPr>
-          <w:lang w:val="en-US"/>
-        </w:rPr>
-        <w:t>condiciones_sobre_agregados</w:t>
-      </w:r>
-      <w:proofErr w:type="spellEnd"/>
-    </w:p>
-    <w:p>
-      <w:pPr>
-        <w:rPr>
-          <w:lang w:val="en-US"/>
-        </w:rPr>
-      </w:pPr>
-      <w:r>
-        <w:rPr>
-          <w:lang w:val="en-US"/>
-        </w:rPr>
-        <w:t xml:space="preserve">ORDER BY </w:t>
-      </w:r>
-      <w:proofErr w:type="spellStart"/>
-      <w:r>
-        <w:rPr>
-          <w:lang w:val="en-US"/>
-        </w:rPr>
-        <w:t>columnas_orden</w:t>
-      </w:r>
-      <w:proofErr w:type="spellEnd"/>
+        <w:t>FROM tabla_base alias</w:t>
+      </w:r>
+    </w:p>
+    <w:p>
+      <w:pPr>
+        <w:rPr>
+          <w:lang w:val="en-US"/>
+        </w:rPr>
+      </w:pPr>
+      <w:r>
+        <w:rPr>
+          <w:lang w:val="en-US"/>
+        </w:rPr>
+        <w:t xml:space="preserve">  [INNER | LEFT | RIGHT] JOIN tabla2 alias2 ON condicion_join</w:t>
+      </w:r>
+    </w:p>
+    <w:p>
+      <w:pPr>
+        <w:rPr>
+          <w:lang w:val="en-US"/>
+        </w:rPr>
+      </w:pPr>
+      <w:r>
+        <w:rPr>
+          <w:lang w:val="en-US"/>
+        </w:rPr>
+        <w:t xml:space="preserve">  [INNER | LEFT | RIGHT] JOIN tabla3 alias3 ON condicion_join</w:t>
+      </w:r>
+    </w:p>
+    <w:p>
+      <w:r>
+        <w:t>WHERE condiciones_fila</w:t>
+      </w:r>
+    </w:p>
+    <w:p>
+      <w:r>
+        <w:t>GROUP BY columnas_de_agrupacion</w:t>
+      </w:r>
+    </w:p>
+    <w:p>
+      <w:pPr>
+        <w:rPr>
+          <w:lang w:val="en-US"/>
+        </w:rPr>
+      </w:pPr>
+      <w:r>
+        <w:rPr>
+          <w:lang w:val="en-US"/>
+        </w:rPr>
+        <w:t>HAVING condiciones_sobre_agregados</w:t>
+      </w:r>
+    </w:p>
+    <w:p>
+      <w:pPr>
+        <w:rPr>
+          <w:lang w:val="en-US"/>
+        </w:rPr>
+      </w:pPr>
+      <w:r>
+        <w:rPr>
+          <w:lang w:val="en-US"/>
+        </w:rPr>
+        <w:t>ORDER BY columnas_orden</w:t>
+      </w:r>
     </w:p>
     <w:p>
       <w:pPr>
@@ -228,64 +164,34 @@
         <w:rPr>
           <w:lang w:val="en-US"/>
         </w:rPr>
-        <w:t xml:space="preserve">DROP TRIGGER IF EXISTS </w:t>
-      </w:r>
-      <w:proofErr w:type="spellStart"/>
-      <w:r>
-        <w:rPr>
-          <w:lang w:val="en-US"/>
-        </w:rPr>
-        <w:t>trg_tabla_ai</w:t>
-      </w:r>
-      <w:proofErr w:type="spellEnd"/>
-      <w:r>
-        <w:rPr>
-          <w:lang w:val="en-US"/>
-        </w:rPr>
-        <w:t xml:space="preserve"> $$</w:t>
-      </w:r>
-    </w:p>
-    <w:p>
-      <w:pPr>
-        <w:rPr>
-          <w:lang w:val="en-US"/>
-        </w:rPr>
-      </w:pPr>
-      <w:r>
-        <w:rPr>
-          <w:lang w:val="en-US"/>
-        </w:rPr>
-        <w:t xml:space="preserve">CREATE TRIGGER </w:t>
-      </w:r>
-      <w:proofErr w:type="spellStart"/>
-      <w:r>
-        <w:rPr>
-          <w:lang w:val="en-US"/>
-        </w:rPr>
-        <w:t>trg_tabla_ai</w:t>
-      </w:r>
-      <w:proofErr w:type="spellEnd"/>
-    </w:p>
-    <w:p>
-      <w:pPr>
-        <w:rPr>
-          <w:lang w:val="en-US"/>
-        </w:rPr>
-      </w:pPr>
-      <w:r>
-        <w:rPr>
-          <w:lang w:val="en-US"/>
-        </w:rPr>
-        <w:t xml:space="preserve">AFTER INSERT ON </w:t>
-      </w:r>
-      <w:proofErr w:type="spellStart"/>
-      <w:r>
-        <w:rPr>
-          <w:lang w:val="en-US"/>
-        </w:rPr>
-        <w:t>tabla_objetivo</w:t>
-      </w:r>
-      <w:proofErr w:type="spellEnd"/>
+        <w:t>DROP TRIGGER IF EXISTS trg_tabla_ai $$</w:t>
+      </w:r>
+    </w:p>
+    <w:p>
+      <w:pPr>
+        <w:rPr>
+          <w:lang w:val="en-US"/>
+        </w:rPr>
+      </w:pPr>
+      <w:r>
+        <w:rPr>
+          <w:lang w:val="en-US"/>
+        </w:rPr>
+        <w:t>CREATE TRIGGER trg_tabla_ai</w:t>
+      </w:r>
+    </w:p>
+    <w:p>
+      <w:pPr>
+        <w:rPr>
+          <w:lang w:val="en-US"/>
+        </w:rPr>
+      </w:pPr>
+      <w:r>
+        <w:rPr>
+          <w:lang w:val="en-US"/>
+        </w:rPr>
+        <w:t>AFTER INSERT ON tabla_objetivo</w:t>
+      </w:r>
     </w:p>
     <w:p>
       <w:pPr>
@@ -323,133 +229,33 @@
         <w:rPr>
           <w:lang w:val="en-US"/>
         </w:rPr>
-        <w:t xml:space="preserve">  -- </w:t>
-      </w:r>
-      <w:proofErr w:type="spellStart"/>
-      <w:r>
-        <w:rPr>
-          <w:lang w:val="en-US"/>
-        </w:rPr>
-        <w:t>ejemplo</w:t>
-      </w:r>
-      <w:proofErr w:type="spellEnd"/>
-      <w:r>
-        <w:rPr>
-          <w:lang w:val="en-US"/>
-        </w:rPr>
-        <w:t xml:space="preserve">: </w:t>
-      </w:r>
-      <w:proofErr w:type="spellStart"/>
-      <w:r>
-        <w:rPr>
-          <w:lang w:val="en-US"/>
-        </w:rPr>
-        <w:t>auditoría</w:t>
-      </w:r>
-      <w:proofErr w:type="spellEnd"/>
-    </w:p>
-    <w:p>
-      <w:pPr>
-        <w:rPr>
-          <w:lang w:val="en-US"/>
-        </w:rPr>
-      </w:pPr>
-      <w:r>
-        <w:rPr>
-          <w:lang w:val="en-US"/>
-        </w:rPr>
-        <w:t xml:space="preserve">  INSERT INTO </w:t>
-      </w:r>
-      <w:proofErr w:type="spellStart"/>
-      <w:r>
-        <w:rPr>
-          <w:lang w:val="en-US"/>
-        </w:rPr>
-        <w:t>tabla_</w:t>
-      </w:r>
-      <w:proofErr w:type="gramStart"/>
-      <w:r>
-        <w:rPr>
-          <w:lang w:val="en-US"/>
-        </w:rPr>
-        <w:t>auditoria</w:t>
-      </w:r>
-      <w:proofErr w:type="spellEnd"/>
-      <w:r>
-        <w:rPr>
-          <w:lang w:val="en-US"/>
-        </w:rPr>
-        <w:t>(</w:t>
-      </w:r>
-      <w:proofErr w:type="spellStart"/>
-      <w:proofErr w:type="gramEnd"/>
-      <w:r>
-        <w:rPr>
-          <w:lang w:val="en-US"/>
-        </w:rPr>
-        <w:t>id_ref</w:t>
-      </w:r>
-      <w:proofErr w:type="spellEnd"/>
-      <w:r>
-        <w:rPr>
-          <w:lang w:val="en-US"/>
-        </w:rPr>
-        <w:t xml:space="preserve">, </w:t>
-      </w:r>
-      <w:proofErr w:type="spellStart"/>
-      <w:r>
-        <w:rPr>
-          <w:lang w:val="en-US"/>
-        </w:rPr>
-        <w:t>accion</w:t>
-      </w:r>
-      <w:proofErr w:type="spellEnd"/>
-      <w:r>
-        <w:rPr>
-          <w:lang w:val="en-US"/>
-        </w:rPr>
-        <w:t xml:space="preserve">, </w:t>
-      </w:r>
-      <w:proofErr w:type="spellStart"/>
-      <w:r>
-        <w:rPr>
-          <w:lang w:val="en-US"/>
-        </w:rPr>
-        <w:t>fecha</w:t>
-      </w:r>
-      <w:proofErr w:type="spellEnd"/>
-      <w:r>
-        <w:rPr>
-          <w:lang w:val="en-US"/>
-        </w:rPr>
-        <w:t>)</w:t>
-      </w:r>
-    </w:p>
-    <w:p>
-      <w:pPr>
-        <w:rPr>
-          <w:lang w:val="en-US"/>
-        </w:rPr>
-      </w:pPr>
-      <w:r>
-        <w:rPr>
-          <w:lang w:val="en-US"/>
-        </w:rPr>
-        <w:t xml:space="preserve">  VALUES (NEW.id, 'INSERT', </w:t>
-      </w:r>
-      <w:proofErr w:type="gramStart"/>
-      <w:r>
-        <w:rPr>
-          <w:lang w:val="en-US"/>
-        </w:rPr>
-        <w:t>NOW(</w:t>
-      </w:r>
-      <w:proofErr w:type="gramEnd"/>
-      <w:r>
-        <w:rPr>
-          <w:lang w:val="en-US"/>
-        </w:rPr>
-        <w:t>));</w:t>
+        <w:t xml:space="preserve">  -- ejemplo: auditoría</w:t>
+      </w:r>
+    </w:p>
+    <w:p>
+      <w:pPr>
+        <w:rPr>
+          <w:lang w:val="en-US"/>
+        </w:rPr>
+      </w:pPr>
+      <w:r>
+        <w:rPr>
+          <w:lang w:val="en-US"/>
+        </w:rPr>
+        <w:t xml:space="preserve">  INSERT INTO tabla_auditoria(id_ref, accion, fecha)</w:t>
+      </w:r>
+    </w:p>
+    <w:p>
+      <w:pPr>
+        <w:rPr>
+          <w:lang w:val="en-US"/>
+        </w:rPr>
+      </w:pPr>
+      <w:r>
+        <w:rPr>
+          <w:lang w:val="en-US"/>
+        </w:rPr>
+        <w:t xml:space="preserve">  VALUES (NEW.id, 'INSERT', NOW());</w:t>
       </w:r>
     </w:p>
     <w:p>
@@ -478,14 +284,12 @@
           <w:lang w:val="en-US"/>
         </w:rPr>
       </w:pPr>
-      <w:proofErr w:type="gramStart"/>
       <w:r>
         <w:rPr>
           <w:lang w:val="en-US"/>
         </w:rPr>
         <w:t>DELIMITER ;</w:t>
       </w:r>
-      <w:proofErr w:type="gramEnd"/>
     </w:p>
     <w:p>
       <w:pPr>
@@ -539,110 +343,46 @@
         <w:rPr>
           <w:lang w:val="en-US"/>
         </w:rPr>
-        <w:t xml:space="preserve">DROP FUNCTION IF EXISTS </w:t>
-      </w:r>
-      <w:proofErr w:type="spellStart"/>
-      <w:r>
-        <w:rPr>
-          <w:lang w:val="en-US"/>
-        </w:rPr>
-        <w:t>fn_algo</w:t>
-      </w:r>
-      <w:proofErr w:type="spellEnd"/>
-      <w:r>
-        <w:rPr>
-          <w:lang w:val="en-US"/>
-        </w:rPr>
-        <w:t xml:space="preserve"> $$</w:t>
-      </w:r>
-    </w:p>
-    <w:p>
-      <w:pPr>
-        <w:rPr>
-          <w:lang w:val="en-US"/>
-        </w:rPr>
-      </w:pPr>
-      <w:r>
-        <w:rPr>
-          <w:lang w:val="en-US"/>
-        </w:rPr>
-        <w:t xml:space="preserve">CREATE FUNCTION </w:t>
-      </w:r>
-      <w:proofErr w:type="spellStart"/>
-      <w:r>
-        <w:rPr>
-          <w:lang w:val="en-US"/>
-        </w:rPr>
-        <w:t>fn_</w:t>
-      </w:r>
-      <w:proofErr w:type="gramStart"/>
-      <w:r>
-        <w:rPr>
-          <w:lang w:val="en-US"/>
-        </w:rPr>
-        <w:t>algo</w:t>
-      </w:r>
-      <w:proofErr w:type="spellEnd"/>
-      <w:r>
-        <w:rPr>
-          <w:lang w:val="en-US"/>
-        </w:rPr>
-        <w:t>(</w:t>
-      </w:r>
-      <w:proofErr w:type="spellStart"/>
-      <w:proofErr w:type="gramEnd"/>
-      <w:r>
-        <w:rPr>
-          <w:lang w:val="en-US"/>
-        </w:rPr>
-        <w:t>p_id</w:t>
-      </w:r>
-      <w:proofErr w:type="spellEnd"/>
-      <w:r>
-        <w:rPr>
-          <w:lang w:val="en-US"/>
-        </w:rPr>
-        <w:t xml:space="preserve"> INT)</w:t>
-      </w:r>
-    </w:p>
-    <w:p>
-      <w:pPr>
-        <w:rPr>
-          <w:lang w:val="en-US"/>
-        </w:rPr>
-      </w:pPr>
-      <w:r>
-        <w:rPr>
-          <w:lang w:val="en-US"/>
-        </w:rPr>
-        <w:t xml:space="preserve">RETURNS </w:t>
-      </w:r>
-      <w:proofErr w:type="gramStart"/>
-      <w:r>
-        <w:rPr>
-          <w:lang w:val="en-US"/>
-        </w:rPr>
-        <w:t>DECIMAL(</w:t>
-      </w:r>
-      <w:proofErr w:type="gramEnd"/>
-      <w:r>
-        <w:rPr>
-          <w:lang w:val="en-US"/>
-        </w:rPr>
-        <w:t>10,2)</w:t>
-      </w:r>
-    </w:p>
-    <w:p>
-      <w:pPr>
-        <w:rPr>
-          <w:lang w:val="en-US"/>
-        </w:rPr>
-      </w:pPr>
-      <w:r>
-        <w:rPr>
-          <w:lang w:val="en-US"/>
-        </w:rPr>
-        <w:t>DETERMINISTIC</w:t>
+        <w:t>DROP FUNCTION IF EXISTS fn_algo $$</w:t>
+      </w:r>
+    </w:p>
+    <w:p>
+      <w:pPr>
+        <w:rPr>
+          <w:lang w:val="en-US"/>
+        </w:rPr>
+      </w:pPr>
+      <w:r>
+        <w:rPr>
+          <w:lang w:val="en-US"/>
+        </w:rPr>
+        <w:t>CREATE FUNCTION fn_algo(p_id INT)</w:t>
+      </w:r>
+    </w:p>
+    <w:p>
+      <w:pPr>
+        <w:rPr>
+          <w:lang w:val="en-US"/>
+        </w:rPr>
+      </w:pPr>
+      <w:r>
+        <w:rPr>
+          <w:lang w:val="en-US"/>
+        </w:rPr>
+        <w:t>RETURNS DECIMAL(10,2)</w:t>
+      </w:r>
+    </w:p>
+    <w:p>
+      <w:pPr>
+        <w:rPr>
+          <w:lang w:val="en-US"/>
+        </w:rPr>
+      </w:pPr>
+      <w:r>
+        <w:rPr>
+          <w:lang w:val="en-US"/>
+        </w:rPr>
+        <w:t>READS SQL DATA</w:t>
       </w:r>
     </w:p>
     <w:p>
@@ -668,175 +408,73 @@
         <w:rPr>
           <w:lang w:val="en-US"/>
         </w:rPr>
-        <w:t xml:space="preserve">  DECLARE </w:t>
-      </w:r>
-      <w:proofErr w:type="spellStart"/>
-      <w:r>
-        <w:rPr>
-          <w:lang w:val="en-US"/>
-        </w:rPr>
-        <w:t>v_result</w:t>
-      </w:r>
-      <w:proofErr w:type="spellEnd"/>
-      <w:r>
-        <w:rPr>
-          <w:lang w:val="en-US"/>
-        </w:rPr>
-        <w:t xml:space="preserve"> </w:t>
-      </w:r>
-      <w:proofErr w:type="gramStart"/>
-      <w:r>
-        <w:rPr>
-          <w:lang w:val="en-US"/>
-        </w:rPr>
-        <w:t>DECIMAL(</w:t>
-      </w:r>
-      <w:proofErr w:type="gramEnd"/>
-      <w:r>
-        <w:rPr>
-          <w:lang w:val="en-US"/>
-        </w:rPr>
-        <w:t>10,2);</w:t>
-      </w:r>
-    </w:p>
-    <w:p>
-      <w:pPr>
-        <w:rPr>
-          <w:lang w:val="en-US"/>
-        </w:rPr>
-      </w:pPr>
-    </w:p>
-    <w:p>
-      <w:pPr>
-        <w:rPr>
-          <w:lang w:val="en-US"/>
-        </w:rPr>
-      </w:pPr>
-      <w:r>
-        <w:rPr>
-          <w:lang w:val="en-US"/>
-        </w:rPr>
-        <w:t xml:space="preserve">  SELECT </w:t>
-      </w:r>
-      <w:proofErr w:type="gramStart"/>
-      <w:r>
-        <w:rPr>
-          <w:lang w:val="en-US"/>
-        </w:rPr>
-        <w:t>SUM(</w:t>
-      </w:r>
-      <w:proofErr w:type="spellStart"/>
-      <w:proofErr w:type="gramEnd"/>
-      <w:r>
-        <w:rPr>
-          <w:lang w:val="en-US"/>
-        </w:rPr>
-        <w:t>col_monto</w:t>
-      </w:r>
-      <w:proofErr w:type="spellEnd"/>
-      <w:r>
-        <w:rPr>
-          <w:lang w:val="en-US"/>
-        </w:rPr>
-        <w:t xml:space="preserve">) INTO </w:t>
-      </w:r>
-      <w:proofErr w:type="spellStart"/>
-      <w:r>
-        <w:rPr>
-          <w:lang w:val="en-US"/>
-        </w:rPr>
-        <w:t>v_result</w:t>
-      </w:r>
-      <w:proofErr w:type="spellEnd"/>
-    </w:p>
-    <w:p>
-      <w:pPr>
-        <w:rPr>
-          <w:lang w:val="en-US"/>
-        </w:rPr>
-      </w:pPr>
-      <w:r>
-        <w:rPr>
-          <w:lang w:val="en-US"/>
-        </w:rPr>
-        <w:t xml:space="preserve">  FROM </w:t>
-      </w:r>
-      <w:proofErr w:type="spellStart"/>
-      <w:r>
-        <w:rPr>
-          <w:lang w:val="en-US"/>
-        </w:rPr>
-        <w:t>tabla</w:t>
-      </w:r>
-      <w:proofErr w:type="spellEnd"/>
-    </w:p>
-    <w:p>
-      <w:pPr>
-        <w:rPr>
-          <w:lang w:val="en-US"/>
-        </w:rPr>
-      </w:pPr>
-      <w:r>
-        <w:rPr>
-          <w:lang w:val="en-US"/>
-        </w:rPr>
-        <w:t xml:space="preserve">  WHERE id = </w:t>
-      </w:r>
-      <w:proofErr w:type="spellStart"/>
-      <w:r>
-        <w:rPr>
-          <w:lang w:val="en-US"/>
-        </w:rPr>
-        <w:t>p_id</w:t>
-      </w:r>
-      <w:proofErr w:type="spellEnd"/>
-      <w:r>
-        <w:rPr>
-          <w:lang w:val="en-US"/>
-        </w:rPr>
-        <w:t>;</w:t>
-      </w:r>
-    </w:p>
-    <w:p>
-      <w:pPr>
-        <w:rPr>
-          <w:lang w:val="en-US"/>
-        </w:rPr>
-      </w:pPr>
-    </w:p>
-    <w:p>
-      <w:pPr>
-        <w:rPr>
-          <w:lang w:val="en-US"/>
-        </w:rPr>
-      </w:pPr>
-      <w:r>
-        <w:rPr>
-          <w:lang w:val="en-US"/>
-        </w:rPr>
-        <w:t xml:space="preserve">  RETURN </w:t>
-      </w:r>
-      <w:proofErr w:type="gramStart"/>
-      <w:r>
-        <w:rPr>
-          <w:lang w:val="en-US"/>
-        </w:rPr>
-        <w:t>IFNULL(</w:t>
-      </w:r>
-      <w:proofErr w:type="spellStart"/>
-      <w:proofErr w:type="gramEnd"/>
-      <w:r>
-        <w:rPr>
-          <w:lang w:val="en-US"/>
-        </w:rPr>
-        <w:t>v_result</w:t>
-      </w:r>
-      <w:proofErr w:type="spellEnd"/>
-      <w:r>
-        <w:rPr>
-          <w:lang w:val="en-US"/>
-        </w:rPr>
-        <w:t>, 0);</w:t>
+        <w:t xml:space="preserve">  DECLARE v_result DECIMAL(10,2);</w:t>
+      </w:r>
+    </w:p>
+    <w:p>
+      <w:pPr>
+        <w:rPr>
+          <w:lang w:val="en-US"/>
+        </w:rPr>
+      </w:pPr>
+    </w:p>
+    <w:p>
+      <w:pPr>
+        <w:rPr>
+          <w:lang w:val="en-US"/>
+        </w:rPr>
+      </w:pPr>
+      <w:r>
+        <w:rPr>
+          <w:lang w:val="en-US"/>
+        </w:rPr>
+        <w:t xml:space="preserve">  SELECT SUM(col_monto) INTO v_result</w:t>
+      </w:r>
+    </w:p>
+    <w:p>
+      <w:pPr>
+        <w:rPr>
+          <w:lang w:val="en-US"/>
+        </w:rPr>
+      </w:pPr>
+      <w:r>
+        <w:rPr>
+          <w:lang w:val="en-US"/>
+        </w:rPr>
+        <w:t xml:space="preserve">  FROM tabla</w:t>
+      </w:r>
+    </w:p>
+    <w:p>
+      <w:pPr>
+        <w:rPr>
+          <w:lang w:val="en-US"/>
+        </w:rPr>
+      </w:pPr>
+      <w:r>
+        <w:rPr>
+          <w:lang w:val="en-US"/>
+        </w:rPr>
+        <w:t xml:space="preserve">  WHERE id = p_id;</w:t>
+      </w:r>
+    </w:p>
+    <w:p>
+      <w:pPr>
+        <w:rPr>
+          <w:lang w:val="en-US"/>
+        </w:rPr>
+      </w:pPr>
+    </w:p>
+    <w:p>
+      <w:pPr>
+        <w:rPr>
+          <w:lang w:val="en-US"/>
+        </w:rPr>
+      </w:pPr>
+      <w:r>
+        <w:rPr>
+          <w:lang w:val="en-US"/>
+        </w:rPr>
+        <w:t xml:space="preserve">  RETURN IFNULL(v_result, 0);</w:t>
       </w:r>
     </w:p>
     <w:p>
@@ -860,11 +498,9 @@
       </w:pPr>
     </w:p>
     <w:p>
-      <w:proofErr w:type="gramStart"/>
       <w:r>
         <w:t>DELIMITER ;</w:t>
       </w:r>
-      <w:proofErr w:type="gramEnd"/>
     </w:p>
     <w:p/>
     <w:p>
@@ -896,21 +532,7 @@
         <w:rPr>
           <w:lang w:val="en-US"/>
         </w:rPr>
-        <w:t xml:space="preserve">UPDATE </w:t>
-      </w:r>
-      <w:proofErr w:type="spellStart"/>
-      <w:r>
-        <w:rPr>
-          <w:lang w:val="en-US"/>
-        </w:rPr>
-        <w:t>tabla</w:t>
-      </w:r>
-      <w:proofErr w:type="spellEnd"/>
-      <w:r>
-        <w:rPr>
-          <w:lang w:val="en-US"/>
-        </w:rPr>
-        <w:t xml:space="preserve"> SET col = 'X' WHERE id = 1;</w:t>
+        <w:t>UPDATE tabla SET col = 'X' WHERE id = 1;</w:t>
       </w:r>
     </w:p>
     <w:p>
@@ -947,15 +569,7 @@
     <w:p>
       <w:r>
         <w:lastRenderedPageBreak/>
-        <w:t>-- si algo salió mal (</w:t>
-      </w:r>
-      <w:proofErr w:type="spellStart"/>
-      <w:r>
-        <w:t>ejecutás</w:t>
-      </w:r>
-      <w:proofErr w:type="spellEnd"/>
-      <w:r>
-        <w:t xml:space="preserve"> esto en vez de COMMIT)</w:t>
+        <w:t>-- si algo salió mal (ejecutás esto en vez de COMMIT)</w:t>
       </w:r>
     </w:p>
     <w:p>
@@ -1002,21 +616,7 @@
         <w:rPr>
           <w:lang w:val="en-US"/>
         </w:rPr>
-        <w:t xml:space="preserve">TRUNCATE TABLE </w:t>
-      </w:r>
-      <w:proofErr w:type="spellStart"/>
-      <w:r>
-        <w:rPr>
-          <w:lang w:val="en-US"/>
-        </w:rPr>
-        <w:t>tabla</w:t>
-      </w:r>
-      <w:proofErr w:type="spellEnd"/>
-      <w:r>
-        <w:rPr>
-          <w:lang w:val="en-US"/>
-        </w:rPr>
-        <w:t>;</w:t>
+        <w:t>TRUNCATE TABLE tabla;</w:t>
       </w:r>
     </w:p>
     <w:p>
@@ -1050,42 +650,20 @@
         <w:rPr>
           <w:lang w:val="en-US"/>
         </w:rPr>
-        <w:t xml:space="preserve">DELETE FROM </w:t>
-      </w:r>
-      <w:proofErr w:type="spellStart"/>
-      <w:r>
-        <w:rPr>
-          <w:lang w:val="en-US"/>
-        </w:rPr>
-        <w:t>tabla</w:t>
-      </w:r>
-      <w:proofErr w:type="spellEnd"/>
-    </w:p>
-    <w:p>
-      <w:pPr>
-        <w:rPr>
-          <w:lang w:val="en-US"/>
-        </w:rPr>
-      </w:pPr>
-      <w:r>
-        <w:rPr>
-          <w:lang w:val="en-US"/>
-        </w:rPr>
-        <w:t xml:space="preserve">WHERE </w:t>
-      </w:r>
-      <w:proofErr w:type="spellStart"/>
-      <w:r>
-        <w:rPr>
-          <w:lang w:val="en-US"/>
-        </w:rPr>
-        <w:t>condicion</w:t>
-      </w:r>
-      <w:proofErr w:type="spellEnd"/>
-      <w:r>
-        <w:rPr>
-          <w:lang w:val="en-US"/>
-        </w:rPr>
-        <w:t>;</w:t>
+        <w:t>DELETE FROM tabla</w:t>
+      </w:r>
+    </w:p>
+    <w:p>
+      <w:pPr>
+        <w:rPr>
+          <w:lang w:val="en-US"/>
+        </w:rPr>
+      </w:pPr>
+      <w:r>
+        <w:rPr>
+          <w:lang w:val="en-US"/>
+        </w:rPr>
+        <w:t>WHERE condicion;</w:t>
       </w:r>
     </w:p>
     <w:p>
@@ -1119,21 +697,7 @@
         <w:rPr>
           <w:lang w:val="en-US"/>
         </w:rPr>
-        <w:t xml:space="preserve">INSERT INTO </w:t>
-      </w:r>
-      <w:proofErr w:type="spellStart"/>
-      <w:r>
-        <w:rPr>
-          <w:lang w:val="en-US"/>
-        </w:rPr>
-        <w:t>tabla</w:t>
-      </w:r>
-      <w:proofErr w:type="spellEnd"/>
-      <w:r>
-        <w:rPr>
-          <w:lang w:val="en-US"/>
-        </w:rPr>
-        <w:t xml:space="preserve"> (col1, col2, col3)</w:t>
+        <w:t>INSERT INTO tabla (col1, col2, col3)</w:t>
       </w:r>
     </w:p>
     <w:p>
@@ -1144,98 +708,46 @@
     <w:p/>
     <w:p>
       <w:r>
-        <w:t xml:space="preserve">INSERT INTO </w:t>
-      </w:r>
-      <w:proofErr w:type="spellStart"/>
-      <w:r>
-        <w:t>tabla_destino</w:t>
-      </w:r>
-      <w:proofErr w:type="spellEnd"/>
-      <w:r>
-        <w:t xml:space="preserve"> (col1, col2)</w:t>
-      </w:r>
-    </w:p>
-    <w:p>
-      <w:pPr>
-        <w:rPr>
-          <w:lang w:val="en-US"/>
-        </w:rPr>
-      </w:pPr>
-      <w:r>
-        <w:rPr>
-          <w:lang w:val="en-US"/>
-        </w:rPr>
-        <w:t xml:space="preserve">SELECT </w:t>
-      </w:r>
-      <w:proofErr w:type="spellStart"/>
-      <w:r>
-        <w:rPr>
-          <w:lang w:val="en-US"/>
-        </w:rPr>
-        <w:t>colA</w:t>
-      </w:r>
-      <w:proofErr w:type="spellEnd"/>
-      <w:r>
-        <w:rPr>
-          <w:lang w:val="en-US"/>
-        </w:rPr>
-        <w:t xml:space="preserve">, </w:t>
-      </w:r>
-      <w:proofErr w:type="spellStart"/>
-      <w:r>
-        <w:rPr>
-          <w:lang w:val="en-US"/>
-        </w:rPr>
-        <w:t>colB</w:t>
-      </w:r>
-      <w:proofErr w:type="spellEnd"/>
-    </w:p>
-    <w:p>
-      <w:pPr>
-        <w:rPr>
-          <w:lang w:val="en-US"/>
-        </w:rPr>
-      </w:pPr>
-      <w:r>
-        <w:rPr>
-          <w:lang w:val="en-US"/>
-        </w:rPr>
-        <w:t xml:space="preserve">FROM </w:t>
-      </w:r>
-      <w:proofErr w:type="spellStart"/>
-      <w:r>
-        <w:rPr>
-          <w:lang w:val="en-US"/>
-        </w:rPr>
-        <w:t>tabla_origen</w:t>
-      </w:r>
-      <w:proofErr w:type="spellEnd"/>
-    </w:p>
-    <w:p>
-      <w:pPr>
-        <w:rPr>
-          <w:lang w:val="en-US"/>
-        </w:rPr>
-      </w:pPr>
-      <w:r>
-        <w:rPr>
-          <w:lang w:val="en-US"/>
-        </w:rPr>
-        <w:t xml:space="preserve">WHERE </w:t>
-      </w:r>
-      <w:proofErr w:type="spellStart"/>
-      <w:r>
-        <w:rPr>
-          <w:lang w:val="en-US"/>
-        </w:rPr>
-        <w:t>condicion</w:t>
-      </w:r>
-      <w:proofErr w:type="spellEnd"/>
-      <w:r>
-        <w:rPr>
-          <w:lang w:val="en-US"/>
-        </w:rPr>
-        <w:t>;</w:t>
+        <w:t>INSERT INTO tabla_destino (col1, col2)</w:t>
+      </w:r>
+    </w:p>
+    <w:p>
+      <w:pPr>
+        <w:rPr>
+          <w:lang w:val="en-US"/>
+        </w:rPr>
+      </w:pPr>
+      <w:r>
+        <w:rPr>
+          <w:lang w:val="en-US"/>
+        </w:rPr>
+        <w:t>SELECT colA, colB</w:t>
+      </w:r>
+    </w:p>
+    <w:p>
+      <w:pPr>
+        <w:rPr>
+          <w:lang w:val="en-US"/>
+        </w:rPr>
+      </w:pPr>
+      <w:r>
+        <w:rPr>
+          <w:lang w:val="en-US"/>
+        </w:rPr>
+        <w:t>FROM tabla_origen</w:t>
+      </w:r>
+    </w:p>
+    <w:p>
+      <w:pPr>
+        <w:rPr>
+          <w:lang w:val="en-US"/>
+        </w:rPr>
+      </w:pPr>
+      <w:r>
+        <w:rPr>
+          <w:lang w:val="en-US"/>
+        </w:rPr>
+        <w:t>WHERE condicion;</w:t>
       </w:r>
     </w:p>
     <w:p>
@@ -1260,38 +772,17 @@
     </w:p>
     <w:p>
       <w:r>
-        <w:t xml:space="preserve">SET col1 = </w:t>
-      </w:r>
-      <w:proofErr w:type="spellStart"/>
-      <w:r>
-        <w:t>nuevo_valor</w:t>
-      </w:r>
-      <w:proofErr w:type="spellEnd"/>
-      <w:r>
-        <w:t>,</w:t>
-      </w:r>
-    </w:p>
-    <w:p>
-      <w:r>
-        <w:t xml:space="preserve">    col2 = </w:t>
-      </w:r>
-      <w:proofErr w:type="spellStart"/>
-      <w:r>
-        <w:t>otro_valor</w:t>
-      </w:r>
-      <w:proofErr w:type="spellEnd"/>
-    </w:p>
-    <w:p>
-      <w:r>
-        <w:t xml:space="preserve">WHERE </w:t>
-      </w:r>
-      <w:proofErr w:type="spellStart"/>
-      <w:r>
-        <w:t>condicion</w:t>
-      </w:r>
-      <w:proofErr w:type="spellEnd"/>
-      <w:r>
-        <w:t>;</w:t>
+        <w:t>SET col1 = nuevo_valor,</w:t>
+      </w:r>
+    </w:p>
+    <w:p>
+      <w:r>
+        <w:t xml:space="preserve">    col2 = otro_valor</w:t>
+      </w:r>
+    </w:p>
+    <w:p>
+      <w:r>
+        <w:t>WHERE condicion;</w:t>
       </w:r>
     </w:p>
     <w:p/>
@@ -1306,92 +797,34 @@
         <w:rPr>
           <w:lang w:val="en-US"/>
         </w:rPr>
-        <w:t xml:space="preserve">UPDATE </w:t>
-      </w:r>
-      <w:proofErr w:type="spellStart"/>
-      <w:r>
-        <w:rPr>
-          <w:lang w:val="en-US"/>
-        </w:rPr>
-        <w:t>tabla</w:t>
-      </w:r>
-      <w:proofErr w:type="spellEnd"/>
-      <w:r>
-        <w:rPr>
-          <w:lang w:val="en-US"/>
-        </w:rPr>
-        <w:t xml:space="preserve"> t</w:t>
-      </w:r>
-    </w:p>
-    <w:p>
-      <w:pPr>
-        <w:rPr>
-          <w:lang w:val="en-US"/>
-        </w:rPr>
-      </w:pPr>
-      <w:r>
-        <w:rPr>
-          <w:lang w:val="en-US"/>
-        </w:rPr>
-        <w:t xml:space="preserve">JOIN </w:t>
-      </w:r>
-      <w:proofErr w:type="spellStart"/>
-      <w:r>
-        <w:rPr>
-          <w:lang w:val="en-US"/>
-        </w:rPr>
-        <w:t>otra</w:t>
-      </w:r>
-      <w:proofErr w:type="spellEnd"/>
-      <w:r>
-        <w:rPr>
-          <w:lang w:val="en-US"/>
-        </w:rPr>
-        <w:t xml:space="preserve"> o ON o.id = </w:t>
-      </w:r>
-      <w:proofErr w:type="spellStart"/>
-      <w:r>
-        <w:rPr>
-          <w:lang w:val="en-US"/>
-        </w:rPr>
-        <w:t>t.id_otro</w:t>
-      </w:r>
-      <w:proofErr w:type="spellEnd"/>
-    </w:p>
-    <w:p>
-      <w:pPr>
-        <w:rPr>
-          <w:lang w:val="en-US"/>
-        </w:rPr>
-      </w:pPr>
-      <w:r>
-        <w:rPr>
-          <w:lang w:val="en-US"/>
-        </w:rPr>
-        <w:t xml:space="preserve">SET </w:t>
-      </w:r>
-      <w:proofErr w:type="spellStart"/>
-      <w:r>
-        <w:rPr>
-          <w:lang w:val="en-US"/>
-        </w:rPr>
-        <w:t>t.col</w:t>
-      </w:r>
-      <w:proofErr w:type="spellEnd"/>
-      <w:r>
-        <w:rPr>
-          <w:lang w:val="en-US"/>
-        </w:rPr>
-        <w:t xml:space="preserve"> = </w:t>
-      </w:r>
-      <w:proofErr w:type="spellStart"/>
-      <w:r>
-        <w:rPr>
-          <w:lang w:val="en-US"/>
-        </w:rPr>
-        <w:t>o.col_ref</w:t>
-      </w:r>
-      <w:proofErr w:type="spellEnd"/>
+        <w:t>UPDATE tabla t</w:t>
+      </w:r>
+    </w:p>
+    <w:p>
+      <w:pPr>
+        <w:rPr>
+          <w:lang w:val="en-US"/>
+        </w:rPr>
+      </w:pPr>
+      <w:r>
+        <w:rPr>
+          <w:lang w:val="en-US"/>
+        </w:rPr>
+        <w:t>JOIN otra o ON o.id = t.id_otro</w:t>
+      </w:r>
+    </w:p>
+    <w:p>
+      <w:pPr>
+        <w:rPr>
+          <w:lang w:val="en-US"/>
+        </w:rPr>
+      </w:pPr>
+      <w:r>
+        <w:rPr>
+          <w:lang w:val="en-US"/>
+        </w:rPr>
+        <w:t>SET t.col = o.col_ref</w:t>
+      </w:r>
     </w:p>
     <w:p>
       <w:pPr>
@@ -1404,21 +837,7 @@
           <w:lang w:val="en-US"/>
         </w:rPr>
         <w:lastRenderedPageBreak/>
-        <w:t xml:space="preserve">WHERE </w:t>
-      </w:r>
-      <w:proofErr w:type="spellStart"/>
-      <w:r>
-        <w:rPr>
-          <w:lang w:val="en-US"/>
-        </w:rPr>
-        <w:t>condicion</w:t>
-      </w:r>
-      <w:proofErr w:type="spellEnd"/>
-      <w:r>
-        <w:rPr>
-          <w:lang w:val="en-US"/>
-        </w:rPr>
-        <w:t>;</w:t>
+        <w:t>WHERE condicion;</w:t>
       </w:r>
     </w:p>
     <w:p>
@@ -1465,90 +884,20 @@
         <w:rPr>
           <w:lang w:val="en-US"/>
         </w:rPr>
-        <w:t xml:space="preserve">DROP PROCEDURE IF EXISTS </w:t>
-      </w:r>
-      <w:proofErr w:type="spellStart"/>
-      <w:r>
-        <w:rPr>
-          <w:lang w:val="en-US"/>
-        </w:rPr>
-        <w:t>sp_algo</w:t>
-      </w:r>
-      <w:proofErr w:type="spellEnd"/>
-      <w:r>
-        <w:rPr>
-          <w:lang w:val="en-US"/>
-        </w:rPr>
-        <w:t xml:space="preserve"> $$</w:t>
-      </w:r>
-    </w:p>
-    <w:p>
-      <w:pPr>
-        <w:rPr>
-          <w:lang w:val="en-US"/>
-        </w:rPr>
-      </w:pPr>
-      <w:r>
-        <w:rPr>
-          <w:lang w:val="en-US"/>
-        </w:rPr>
-        <w:t xml:space="preserve">CREATE PROCEDURE </w:t>
-      </w:r>
-      <w:proofErr w:type="spellStart"/>
-      <w:r>
-        <w:rPr>
-          <w:lang w:val="en-US"/>
-        </w:rPr>
-        <w:t>sp_</w:t>
-      </w:r>
-      <w:proofErr w:type="gramStart"/>
-      <w:r>
-        <w:rPr>
-          <w:lang w:val="en-US"/>
-        </w:rPr>
-        <w:t>algo</w:t>
-      </w:r>
-      <w:proofErr w:type="spellEnd"/>
-      <w:r>
-        <w:rPr>
-          <w:lang w:val="en-US"/>
-        </w:rPr>
-        <w:t>(</w:t>
-      </w:r>
-      <w:proofErr w:type="gramEnd"/>
-      <w:r>
-        <w:rPr>
-          <w:lang w:val="en-US"/>
-        </w:rPr>
-        <w:t xml:space="preserve">IN </w:t>
-      </w:r>
-      <w:proofErr w:type="spellStart"/>
-      <w:r>
-        <w:rPr>
-          <w:lang w:val="en-US"/>
-        </w:rPr>
-        <w:t>p_id</w:t>
-      </w:r>
-      <w:proofErr w:type="spellEnd"/>
-      <w:r>
-        <w:rPr>
-          <w:lang w:val="en-US"/>
-        </w:rPr>
-        <w:t xml:space="preserve"> INT, OUT </w:t>
-      </w:r>
-      <w:proofErr w:type="spellStart"/>
-      <w:r>
-        <w:rPr>
-          <w:lang w:val="en-US"/>
-        </w:rPr>
-        <w:t>p_total</w:t>
-      </w:r>
-      <w:proofErr w:type="spellEnd"/>
-      <w:r>
-        <w:rPr>
-          <w:lang w:val="en-US"/>
-        </w:rPr>
-        <w:t xml:space="preserve"> INT)</w:t>
+        <w:t>DROP PROCEDURE IF EXISTS sp_algo $$</w:t>
+      </w:r>
+    </w:p>
+    <w:p>
+      <w:pPr>
+        <w:rPr>
+          <w:lang w:val="en-US"/>
+        </w:rPr>
+      </w:pPr>
+      <w:r>
+        <w:rPr>
+          <w:lang w:val="en-US"/>
+        </w:rPr>
+        <w:t>CREATE PROCEDURE sp_algo(IN p_id INT, OUT p_total INT)</w:t>
       </w:r>
     </w:p>
     <w:p>
@@ -1574,77 +923,33 @@
         <w:rPr>
           <w:lang w:val="en-US"/>
         </w:rPr>
-        <w:t xml:space="preserve">  SELECT </w:t>
-      </w:r>
-      <w:proofErr w:type="gramStart"/>
-      <w:r>
-        <w:rPr>
-          <w:lang w:val="en-US"/>
-        </w:rPr>
-        <w:t>COUNT(</w:t>
-      </w:r>
-      <w:proofErr w:type="gramEnd"/>
-      <w:r>
-        <w:rPr>
-          <w:lang w:val="en-US"/>
-        </w:rPr>
-        <w:t xml:space="preserve">*) INTO </w:t>
-      </w:r>
-      <w:proofErr w:type="spellStart"/>
-      <w:r>
-        <w:rPr>
-          <w:lang w:val="en-US"/>
-        </w:rPr>
-        <w:t>p_total</w:t>
-      </w:r>
-      <w:proofErr w:type="spellEnd"/>
-    </w:p>
-    <w:p>
-      <w:pPr>
-        <w:rPr>
-          <w:lang w:val="en-US"/>
-        </w:rPr>
-      </w:pPr>
-      <w:r>
-        <w:rPr>
-          <w:lang w:val="en-US"/>
-        </w:rPr>
-        <w:t xml:space="preserve">  FROM </w:t>
-      </w:r>
-      <w:proofErr w:type="spellStart"/>
-      <w:r>
-        <w:rPr>
-          <w:lang w:val="en-US"/>
-        </w:rPr>
-        <w:t>tabla</w:t>
-      </w:r>
-      <w:proofErr w:type="spellEnd"/>
-    </w:p>
-    <w:p>
-      <w:pPr>
-        <w:rPr>
-          <w:lang w:val="en-US"/>
-        </w:rPr>
-      </w:pPr>
-      <w:r>
-        <w:rPr>
-          <w:lang w:val="en-US"/>
-        </w:rPr>
-        <w:t xml:space="preserve">  WHERE id = </w:t>
-      </w:r>
-      <w:proofErr w:type="spellStart"/>
-      <w:r>
-        <w:rPr>
-          <w:lang w:val="en-US"/>
-        </w:rPr>
-        <w:t>p_id</w:t>
-      </w:r>
-      <w:proofErr w:type="spellEnd"/>
-      <w:r>
-        <w:rPr>
-          <w:lang w:val="en-US"/>
-        </w:rPr>
-        <w:t>;</w:t>
+        <w:t xml:space="preserve">  SELECT COUNT(*) INTO p_total</w:t>
+      </w:r>
+    </w:p>
+    <w:p>
+      <w:pPr>
+        <w:rPr>
+          <w:lang w:val="en-US"/>
+        </w:rPr>
+      </w:pPr>
+      <w:r>
+        <w:rPr>
+          <w:lang w:val="en-US"/>
+        </w:rPr>
+        <w:t xml:space="preserve">  FROM tabla</w:t>
+      </w:r>
+    </w:p>
+    <w:p>
+      <w:pPr>
+        <w:rPr>
+          <w:lang w:val="en-US"/>
+        </w:rPr>
+      </w:pPr>
+      <w:r>
+        <w:rPr>
+          <w:lang w:val="en-US"/>
+        </w:rPr>
+        <w:t xml:space="preserve">  WHERE id = p_id;</w:t>
       </w:r>
     </w:p>
     <w:p>
@@ -1668,11 +973,9 @@
       </w:pPr>
     </w:p>
     <w:p>
-      <w:proofErr w:type="gramStart"/>
       <w:r>
         <w:t>DELIMITER ;</w:t>
       </w:r>
-      <w:proofErr w:type="gramEnd"/>
     </w:p>
     <w:p/>
     <w:p>
@@ -1682,23 +985,7 @@
     </w:p>
     <w:p>
       <w:r>
-        <w:t xml:space="preserve">CALL </w:t>
-      </w:r>
-      <w:proofErr w:type="spellStart"/>
-      <w:r>
-        <w:t>sp_</w:t>
-      </w:r>
-      <w:proofErr w:type="gramStart"/>
-      <w:r>
-        <w:t>algo</w:t>
-      </w:r>
-      <w:proofErr w:type="spellEnd"/>
-      <w:r>
-        <w:t>(</w:t>
-      </w:r>
-      <w:proofErr w:type="gramEnd"/>
-      <w:r>
-        <w:t>10, @total);</w:t>
+        <w:t>CALL sp_algo(10, @total);</w:t>
       </w:r>
     </w:p>
     <w:p>
@@ -1721,243 +1008,121 @@
     </w:p>
     <w:p>
       <w:r>
-        <w:t xml:space="preserve">alter table </w:t>
-      </w:r>
-      <w:proofErr w:type="spellStart"/>
-      <w:r>
-        <w:t>nombre_tabla</w:t>
-      </w:r>
-      <w:proofErr w:type="spellEnd"/>
+        <w:t>alter table nombre_tabla</w:t>
+      </w:r>
     </w:p>
     <w:p>
       <w:r>
         <w:tab/>
-      </w:r>
-      <w:proofErr w:type="spellStart"/>
-      <w:r>
+        <w:t>add column nueva_columna int;</w:t>
+      </w:r>
+    </w:p>
+    <w:p>
+      <w:pPr>
+        <w:rPr>
+          <w:lang w:val="en-US"/>
+        </w:rPr>
+      </w:pPr>
+      <w:r>
+        <w:tab/>
+      </w:r>
+      <w:r>
+        <w:rPr>
+          <w:lang w:val="en-US"/>
+        </w:rPr>
+        <w:t>modify column col varchar(50) not null</w:t>
+      </w:r>
+    </w:p>
+    <w:p>
+      <w:pPr>
+        <w:ind w:firstLine="708"/>
+        <w:rPr>
+          <w:lang w:val="en-US"/>
+        </w:rPr>
+      </w:pPr>
+      <w:r>
+        <w:rPr>
+          <w:lang w:val="en-US"/>
+        </w:rPr>
+        <w:t>change column col col_nueva varchar(50) not null</w:t>
+      </w:r>
+    </w:p>
+    <w:p>
+      <w:pPr>
+        <w:ind w:firstLine="708"/>
+        <w:rPr>
+          <w:lang w:val="en-US"/>
+        </w:rPr>
+      </w:pPr>
+      <w:r>
+        <w:rPr>
+          <w:lang w:val="en-US"/>
+        </w:rPr>
+        <w:t>drop column col</w:t>
+      </w:r>
+    </w:p>
+    <w:p>
+      <w:pPr>
+        <w:ind w:firstLine="708"/>
+        <w:rPr>
+          <w:lang w:val="en-US"/>
+        </w:rPr>
+      </w:pPr>
+      <w:r>
+        <w:rPr>
+          <w:lang w:val="en-US"/>
+        </w:rPr>
+        <w:t>add primary key (col)</w:t>
+      </w:r>
+    </w:p>
+    <w:p>
+      <w:pPr>
+        <w:ind w:firstLine="708"/>
+        <w:rPr>
+          <w:lang w:val="en-US"/>
+        </w:rPr>
+      </w:pPr>
+      <w:r>
+        <w:rPr>
+          <w:lang w:val="en-US"/>
+        </w:rPr>
         <w:t>add</w:t>
       </w:r>
-      <w:proofErr w:type="spellEnd"/>
-      <w:r>
+      <w:r>
+        <w:rPr>
+          <w:lang w:val="en-US"/>
+        </w:rPr>
         <w:t xml:space="preserve"> </w:t>
       </w:r>
-      <w:proofErr w:type="spellStart"/>
-      <w:r>
-        <w:t>column</w:t>
-      </w:r>
-      <w:proofErr w:type="spellEnd"/>
-      <w:r>
+      <w:r>
+        <w:rPr>
+          <w:lang w:val="en-US"/>
+        </w:rPr>
+        <w:t>constraint fk_nombre</w:t>
+      </w:r>
+      <w:r>
+        <w:rPr>
+          <w:lang w:val="en-US"/>
+        </w:rPr>
         <w:t xml:space="preserve"> </w:t>
       </w:r>
-      <w:proofErr w:type="spellStart"/>
-      <w:r>
-        <w:t>nueva_columna</w:t>
-      </w:r>
-      <w:proofErr w:type="spellEnd"/>
-      <w:r>
+      <w:r>
+        <w:rPr>
+          <w:lang w:val="en-US"/>
+        </w:rPr>
+        <w:t>foreign key (col_fk) references</w:t>
+      </w:r>
+      <w:r>
+        <w:rPr>
+          <w:lang w:val="en-US"/>
+        </w:rPr>
         <w:t xml:space="preserve"> </w:t>
       </w:r>
-      <w:proofErr w:type="spellStart"/>
-      <w:r>
-        <w:t>int</w:t>
-      </w:r>
-      <w:proofErr w:type="spellEnd"/>
-      <w:r>
-        <w:t>;</w:t>
-      </w:r>
-    </w:p>
-    <w:p>
-      <w:pPr>
-        <w:rPr>
-          <w:lang w:val="en-US"/>
-        </w:rPr>
-      </w:pPr>
-      <w:r>
-        <w:tab/>
-      </w:r>
-      <w:r>
-        <w:rPr>
-          <w:lang w:val="en-US"/>
-        </w:rPr>
-        <w:t xml:space="preserve">modify column col </w:t>
-      </w:r>
-      <w:proofErr w:type="gramStart"/>
-      <w:r>
-        <w:rPr>
-          <w:lang w:val="en-US"/>
-        </w:rPr>
-        <w:t>varchar(</w:t>
-      </w:r>
-      <w:proofErr w:type="gramEnd"/>
-      <w:r>
-        <w:rPr>
-          <w:lang w:val="en-US"/>
-        </w:rPr>
-        <w:t>50) not null</w:t>
-      </w:r>
-    </w:p>
-    <w:p>
-      <w:pPr>
-        <w:ind w:firstLine="708"/>
-        <w:rPr>
-          <w:lang w:val="en-US"/>
-        </w:rPr>
-      </w:pPr>
-      <w:r>
-        <w:rPr>
-          <w:lang w:val="en-US"/>
-        </w:rPr>
-        <w:t xml:space="preserve">change column col </w:t>
-      </w:r>
-      <w:proofErr w:type="spellStart"/>
-      <w:r>
-        <w:rPr>
-          <w:lang w:val="en-US"/>
-        </w:rPr>
-        <w:t>col_nueva</w:t>
-      </w:r>
-      <w:proofErr w:type="spellEnd"/>
-      <w:r>
-        <w:rPr>
-          <w:lang w:val="en-US"/>
-        </w:rPr>
-        <w:t xml:space="preserve"> </w:t>
-      </w:r>
-      <w:proofErr w:type="gramStart"/>
-      <w:r>
-        <w:rPr>
-          <w:lang w:val="en-US"/>
-        </w:rPr>
-        <w:t>varchar(</w:t>
-      </w:r>
-      <w:proofErr w:type="gramEnd"/>
-      <w:r>
-        <w:rPr>
-          <w:lang w:val="en-US"/>
-        </w:rPr>
-        <w:t>50) not null</w:t>
-      </w:r>
-    </w:p>
-    <w:p>
-      <w:pPr>
-        <w:ind w:firstLine="708"/>
-        <w:rPr>
-          <w:lang w:val="en-US"/>
-        </w:rPr>
-      </w:pPr>
-      <w:r>
-        <w:rPr>
-          <w:lang w:val="en-US"/>
-        </w:rPr>
-        <w:t>drop column col</w:t>
-      </w:r>
-    </w:p>
-    <w:p>
-      <w:pPr>
-        <w:ind w:firstLine="708"/>
-        <w:rPr>
-          <w:lang w:val="en-US"/>
-        </w:rPr>
-      </w:pPr>
-      <w:r>
-        <w:rPr>
-          <w:lang w:val="en-US"/>
-        </w:rPr>
-        <w:t>add primary key (col)</w:t>
-      </w:r>
-    </w:p>
-    <w:p>
-      <w:pPr>
-        <w:ind w:firstLine="708"/>
-        <w:rPr>
-          <w:lang w:val="en-US"/>
-        </w:rPr>
-      </w:pPr>
-      <w:r>
-        <w:rPr>
-          <w:lang w:val="en-US"/>
-        </w:rPr>
-        <w:t>add</w:t>
-      </w:r>
-      <w:r>
-        <w:rPr>
-          <w:lang w:val="en-US"/>
-        </w:rPr>
-        <w:t xml:space="preserve"> </w:t>
-      </w:r>
-      <w:r>
-        <w:rPr>
-          <w:lang w:val="en-US"/>
-        </w:rPr>
-        <w:t xml:space="preserve">constraint </w:t>
-      </w:r>
-      <w:proofErr w:type="spellStart"/>
-      <w:r>
-        <w:rPr>
-          <w:lang w:val="en-US"/>
-        </w:rPr>
-        <w:t>fk_nombre</w:t>
-      </w:r>
-      <w:proofErr w:type="spellEnd"/>
-      <w:r>
-        <w:rPr>
-          <w:lang w:val="en-US"/>
-        </w:rPr>
-        <w:t xml:space="preserve"> </w:t>
-      </w:r>
-      <w:r>
-        <w:rPr>
-          <w:lang w:val="en-US"/>
-        </w:rPr>
-        <w:t>foreign key (</w:t>
-      </w:r>
-      <w:proofErr w:type="spellStart"/>
-      <w:r>
-        <w:rPr>
-          <w:lang w:val="en-US"/>
-        </w:rPr>
-        <w:t>col_fk</w:t>
-      </w:r>
-      <w:proofErr w:type="spellEnd"/>
-      <w:r>
-        <w:rPr>
-          <w:lang w:val="en-US"/>
-        </w:rPr>
-        <w:t>) references</w:t>
-      </w:r>
-      <w:r>
-        <w:rPr>
-          <w:lang w:val="en-US"/>
-        </w:rPr>
-        <w:t xml:space="preserve"> </w:t>
-      </w:r>
-      <w:proofErr w:type="spellStart"/>
-      <w:r>
-        <w:rPr>
-          <w:lang w:val="en-US"/>
-        </w:rPr>
-        <w:t>otra_tabla</w:t>
-      </w:r>
-      <w:proofErr w:type="spellEnd"/>
-      <w:r>
-        <w:rPr>
-          <w:lang w:val="en-US"/>
-        </w:rPr>
-        <w:t>(</w:t>
-      </w:r>
-      <w:proofErr w:type="spellStart"/>
-      <w:r>
-        <w:rPr>
-          <w:lang w:val="en-US"/>
-        </w:rPr>
-        <w:t>col_pk</w:t>
-      </w:r>
-      <w:proofErr w:type="spellEnd"/>
-      <w:r>
-        <w:rPr>
-          <w:lang w:val="en-US"/>
-        </w:rPr>
-        <w:t>);</w:t>
+      <w:r>
+        <w:rPr>
+          <w:lang w:val="en-US"/>
+        </w:rPr>
+        <w:t>otra_tabla(col_pk);</w:t>
       </w:r>
     </w:p>
     <w:sectPr>
@@ -2700,6 +1865,7 @@
   <w:style w:type="character" w:default="1" w:styleId="Fuentedeprrafopredeter">
     <w:name w:val="Default Paragraph Font"/>
     <w:uiPriority w:val="1"/>
+    <w:semiHidden/>
     <w:unhideWhenUsed/>
   </w:style>
   <w:style w:type="table" w:default="1" w:styleId="Tablanormal">

</xml_diff>